<commit_message>
Corrige exceso de negrita y subrayado en template Word
</commit_message>
<xml_diff>
--- a/app/templates/compraventa.docx
+++ b/app/templates/compraventa.docx
@@ -580,9 +580,10 @@
       <w:r>
         <w:rPr>
           <w:rFonts w:ascii="Aptos" w:hAnsi="Aptos" w:cs="Arial"/>
-          <w:b/>
-          <w:sz w:val="23"/>
-          <w:szCs w:val="23"/>
+          <w:b w:val="0"/>
+          <w:sz w:val="23"/>
+          <w:szCs w:val="23"/>
+          <w:u w:val="none"/>
           <w:lang w:val="es-ES"/>
         </w:rPr>
         <w:t>4. DERECHO QUE SE TRASMITE. (CUOTA PARTE).- La parte vendedora trasmite a la parte compradora: LA PROPIEDAD del vehículo a que se refiere la cláusula 3, a saber las {cuota_parte} avas partes.-</w:t>
@@ -591,9 +592,10 @@
       <w:r>
         <w:rPr>
           <w:rFonts w:ascii="Aptos" w:hAnsi="Aptos" w:cs="Arial"/>
-          <w:b/>
-          <w:sz w:val="23"/>
-          <w:szCs w:val="23"/>
+          <w:b w:val="0"/>
+          <w:sz w:val="23"/>
+          <w:szCs w:val="23"/>
+          <w:u w:val="none"/>
           <w:lang w:val="es-ES"/>
         </w:rPr>
       </w:r>
@@ -601,52 +603,63 @@
       <w:r>
         <w:rPr>
           <w:rFonts w:ascii="Aptos" w:hAnsi="Aptos" w:cs="Arial"/>
-          <w:sz w:val="23"/>
-          <w:szCs w:val="23"/>
+          <w:b w:val="0"/>
+          <w:sz w:val="23"/>
+          <w:szCs w:val="23"/>
+          <w:u w:val="none"/>
           <w:lang w:val="es-ES"/>
         </w:rPr>
       </w:r>
       <w:r>
         <w:rPr>
           <w:rFonts w:ascii="Aptos" w:hAnsi="Aptos" w:cs="Arial"/>
-          <w:bCs/>
-          <w:sz w:val="23"/>
-          <w:szCs w:val="23"/>
+          <w:b w:val="0"/>
+          <w:bCs/>
+          <w:sz w:val="23"/>
+          <w:szCs w:val="23"/>
+          <w:u w:val="none"/>
           <w:lang w:val="es-ES"/>
         </w:rPr>
       </w:r>
       <w:r>
         <w:rPr>
           <w:rFonts w:ascii="Aptos" w:hAnsi="Aptos" w:cs="Arial"/>
-          <w:b/>
-          <w:sz w:val="23"/>
-          <w:szCs w:val="23"/>
+          <w:b w:val="0"/>
+          <w:sz w:val="23"/>
+          <w:szCs w:val="23"/>
+          <w:u w:val="none"/>
           <w:lang w:val="es-ES"/>
         </w:rPr>
       </w:r>
       <w:r>
         <w:rPr>
           <w:rFonts w:ascii="Aptos" w:hAnsi="Aptos" w:cs="Arial"/>
-          <w:bCs/>
-          <w:sz w:val="23"/>
-          <w:szCs w:val="23"/>
+          <w:b w:val="0"/>
+          <w:bCs/>
+          <w:sz w:val="23"/>
+          <w:szCs w:val="23"/>
+          <w:u w:val="none"/>
           <w:lang w:val="es-ES"/>
         </w:rPr>
       </w:r>
       <w:r>
         <w:rPr>
           <w:rFonts w:ascii="Aptos" w:hAnsi="Aptos" w:cs="Arial"/>
-          <w:sz w:val="23"/>
-          <w:szCs w:val="23"/>
+          <w:b w:val="0"/>
+          <w:sz w:val="23"/>
+          <w:szCs w:val="23"/>
+          <w:u w:val="none"/>
           <w:lang w:val="es-ES"/>
         </w:rPr>
       </w:r>
       <w:r>
         <w:rPr>
           <w:rFonts w:ascii="Aptos" w:hAnsi="Aptos" w:cs="Arial"/>
-          <w:bCs/>
-          <w:sz w:val="23"/>
-          <w:szCs w:val="23"/>
+          <w:b w:val="0"/>
+          <w:bCs/>
+          <w:sz w:val="23"/>
+          <w:szCs w:val="23"/>
+          <w:u w:val="none"/>
           <w:lang w:val="es-ES"/>
         </w:rPr>
       </w:r>
@@ -654,9 +667,11 @@
       <w:r>
         <w:rPr>
           <w:rFonts w:ascii="Aptos" w:hAnsi="Aptos" w:cs="Arial"/>
-          <w:bCs/>
-          <w:sz w:val="23"/>
-          <w:szCs w:val="23"/>
+          <w:b w:val="0"/>
+          <w:bCs/>
+          <w:sz w:val="23"/>
+          <w:szCs w:val="23"/>
+          <w:u w:val="none"/>
           <w:lang w:val="es-ES"/>
         </w:rPr>
       </w:r>
@@ -664,9 +679,11 @@
       <w:r>
         <w:rPr>
           <w:rFonts w:ascii="Aptos" w:hAnsi="Aptos" w:cs="Arial"/>
-          <w:bCs/>
-          <w:sz w:val="23"/>
-          <w:szCs w:val="23"/>
+          <w:b w:val="0"/>
+          <w:bCs/>
+          <w:sz w:val="23"/>
+          <w:szCs w:val="23"/>
+          <w:u w:val="none"/>
           <w:lang w:val="es-ES"/>
         </w:rPr>
       </w:r>
@@ -795,9 +812,10 @@
       <w:r>
         <w:rPr>
           <w:rFonts w:ascii="Aptos" w:eastAsia="Times New Roman" w:hAnsi="Aptos" w:cs="Arial"/>
-          <w:b/>
-          <w:sz w:val="23"/>
-          <w:szCs w:val="23"/>
+          <w:b w:val="0"/>
+          <w:sz w:val="23"/>
+          <w:szCs w:val="23"/>
+          <w:u w:val="none"/>
           <w:lang w:eastAsia="es-ES"/>
         </w:rPr>
         <w:t>{tradicion_texto}</w:t>
@@ -805,9 +823,11 @@
       <w:r>
         <w:rPr>
           <w:rFonts w:ascii="Aptos" w:eastAsia="Times New Roman" w:hAnsi="Aptos" w:cs="Arial"/>
-          <w:bCs/>
-          <w:sz w:val="23"/>
-          <w:szCs w:val="23"/>
+          <w:b w:val="0"/>
+          <w:bCs/>
+          <w:sz w:val="23"/>
+          <w:szCs w:val="23"/>
+          <w:u w:val="none"/>
           <w:lang w:eastAsia="es-ES"/>
         </w:rPr>
       </w:r>
@@ -973,9 +993,10 @@
       <w:r>
         <w:rPr>
           <w:rFonts w:ascii="Aptos" w:eastAsia="Times New Roman" w:hAnsi="Aptos" w:cs="Arial"/>
-          <w:b/>
-          <w:sz w:val="23"/>
-          <w:szCs w:val="23"/>
+          <w:b w:val="0"/>
+          <w:sz w:val="23"/>
+          <w:szCs w:val="23"/>
+          <w:u w:val="none"/>
           <w:lang w:eastAsia="es-ES"/>
         </w:rPr>
         <w:t>{declaracion_texto}</w:t>
@@ -983,9 +1004,11 @@
       <w:r>
         <w:rPr>
           <w:rFonts w:ascii="Aptos" w:eastAsia="Times New Roman" w:hAnsi="Aptos" w:cs="Arial"/>
-          <w:bCs/>
-          <w:sz w:val="23"/>
-          <w:szCs w:val="23"/>
+          <w:b w:val="0"/>
+          <w:bCs/>
+          <w:sz w:val="23"/>
+          <w:szCs w:val="23"/>
+          <w:u w:val="none"/>
           <w:lang w:eastAsia="es-ES"/>
         </w:rPr>
       </w:r>
@@ -993,9 +1016,11 @@
       <w:r>
         <w:rPr>
           <w:rFonts w:ascii="Aptos" w:eastAsia="Times New Roman" w:hAnsi="Aptos" w:cs="Arial"/>
-          <w:bCs/>
-          <w:sz w:val="23"/>
-          <w:szCs w:val="23"/>
+          <w:b w:val="0"/>
+          <w:bCs/>
+          <w:sz w:val="23"/>
+          <w:szCs w:val="23"/>
+          <w:u w:val="none"/>
           <w:lang w:eastAsia="es-ES"/>
         </w:rPr>
       </w:r>
@@ -1003,9 +1028,11 @@
       <w:r>
         <w:rPr>
           <w:rFonts w:ascii="Aptos" w:eastAsia="Times New Roman" w:hAnsi="Aptos" w:cs="Arial"/>
-          <w:bCs/>
-          <w:sz w:val="23"/>
-          <w:szCs w:val="23"/>
+          <w:b w:val="0"/>
+          <w:bCs/>
+          <w:sz w:val="23"/>
+          <w:szCs w:val="23"/>
+          <w:u w:val="none"/>
           <w:lang w:eastAsia="es-ES"/>
         </w:rPr>
       </w:r>
@@ -1074,9 +1101,10 @@
       <w:r>
         <w:rPr>
           <w:rFonts w:ascii="Aptos" w:eastAsia="Times New Roman" w:hAnsi="Aptos" w:cs="Arial"/>
-          <w:b/>
-          <w:sz w:val="23"/>
-          <w:szCs w:val="23"/>
+          <w:b w:val="0"/>
+          <w:sz w:val="23"/>
+          <w:szCs w:val="23"/>
+          <w:u w:val="none"/>
           <w:lang w:eastAsia="es-ES"/>
         </w:rPr>
         <w:t>{solicitud_intervencion_texto}</w:t>
@@ -1084,72 +1112,82 @@
       <w:r>
         <w:rPr>
           <w:rFonts w:ascii="Aptos" w:eastAsia="Times New Roman" w:hAnsi="Aptos" w:cs="Arial"/>
-          <w:bCs/>
-          <w:sz w:val="23"/>
-          <w:szCs w:val="23"/>
+          <w:b w:val="0"/>
+          <w:bCs/>
+          <w:sz w:val="23"/>
+          <w:szCs w:val="23"/>
+          <w:u w:val="none"/>
           <w:lang w:eastAsia="es-ES"/>
         </w:rPr>
       </w:r>
       <w:r>
         <w:rPr>
           <w:rFonts w:ascii="Aptos" w:eastAsia="Times New Roman" w:hAnsi="Aptos" w:cs="Arial"/>
-          <w:bCs/>
-          <w:sz w:val="23"/>
-          <w:szCs w:val="23"/>
+          <w:b w:val="0"/>
+          <w:bCs/>
+          <w:sz w:val="23"/>
+          <w:szCs w:val="23"/>
+          <w:u w:val="none"/>
           <w:lang w:eastAsia="es-ES"/>
         </w:rPr>
       </w:r>
       <w:r>
         <w:rPr>
           <w:rFonts w:ascii="Aptos" w:eastAsia="Times New Roman" w:hAnsi="Aptos" w:cs="Arial"/>
-          <w:b/>
-          <w:sz w:val="23"/>
-          <w:szCs w:val="23"/>
+          <w:b w:val="0"/>
+          <w:sz w:val="23"/>
+          <w:szCs w:val="23"/>
+          <w:u w:val="none"/>
           <w:lang w:eastAsia="es-ES"/>
         </w:rPr>
       </w:r>
       <w:r>
         <w:rPr>
           <w:rFonts w:ascii="Aptos" w:hAnsi="Aptos" w:cs="Arial"/>
-          <w:b/>
-          <w:sz w:val="23"/>
-          <w:szCs w:val="23"/>
+          <w:b w:val="0"/>
+          <w:sz w:val="23"/>
+          <w:szCs w:val="23"/>
+          <w:u w:val="none"/>
           <w:lang w:val="es-ES_tradnl"/>
         </w:rPr>
       </w:r>
       <w:r>
         <w:rPr>
           <w:rFonts w:ascii="Aptos" w:hAnsi="Aptos" w:cs="Arial"/>
-          <w:b/>
-          <w:sz w:val="23"/>
-          <w:szCs w:val="23"/>
+          <w:b w:val="0"/>
+          <w:sz w:val="23"/>
+          <w:szCs w:val="23"/>
+          <w:u w:val="none"/>
           <w:lang w:val="es-ES_tradnl"/>
         </w:rPr>
       </w:r>
       <w:r>
         <w:rPr>
           <w:rFonts w:ascii="Aptos" w:hAnsi="Aptos"/>
-          <w:b/>
-          <w:sz w:val="25"/>
-          <w:szCs w:val="25"/>
-          <w:lang w:val="es-ES_tradnl" w:eastAsia="es-ES_tradnl"/>
-        </w:rPr>
-      </w:r>
-      <w:r>
-        <w:rPr>
-          <w:rFonts w:ascii="Aptos" w:hAnsi="Aptos" w:cs="Arial"/>
-          <w:b/>
-          <w:sz w:val="23"/>
-          <w:szCs w:val="23"/>
+          <w:b w:val="0"/>
+          <w:sz w:val="25"/>
+          <w:szCs w:val="25"/>
+          <w:u w:val="none"/>
+          <w:lang w:val="es-ES_tradnl" w:eastAsia="es-ES_tradnl"/>
+        </w:rPr>
+      </w:r>
+      <w:r>
+        <w:rPr>
+          <w:rFonts w:ascii="Aptos" w:hAnsi="Aptos" w:cs="Arial"/>
+          <w:b w:val="0"/>
+          <w:sz w:val="23"/>
+          <w:szCs w:val="23"/>
+          <w:u w:val="none"/>
           <w:lang w:val="es-UY"/>
         </w:rPr>
       </w:r>
       <w:r>
         <w:rPr>
           <w:rFonts w:ascii="Aptos" w:hAnsi="Aptos" w:cs="Arial"/>
-          <w:b/>
-          <w:sz w:val="23"/>
-          <w:szCs w:val="23"/>
+          <w:b w:val="0"/>
+          <w:sz w:val="23"/>
+          <w:szCs w:val="23"/>
+          <w:u w:val="none"/>
           <w:lang w:val="es-UY"/>
         </w:rPr>
       </w:r>
@@ -1170,11 +1208,11 @@
       <w:r>
         <w:rPr>
           <w:rFonts w:ascii="Aptos" w:hAnsi="Aptos"/>
-          <w:b/>
-          <w:bCs/>
-          <w:sz w:val="25"/>
-          <w:szCs w:val="25"/>
-          <w:u w:val="single"/>
+          <w:b w:val="0"/>
+          <w:bCs/>
+          <w:sz w:val="25"/>
+          <w:szCs w:val="25"/>
+          <w:u w:val="none"/>
           <w:lang w:val="es-ES_tradnl" w:eastAsia="es-ES_tradnl"/>
         </w:rPr>
         <w:t>{certifico_que}</w:t>
@@ -1182,25 +1220,30 @@
       <w:r>
         <w:rPr>
           <w:rFonts w:ascii="Aptos" w:hAnsi="Aptos"/>
-          <w:sz w:val="25"/>
-          <w:szCs w:val="25"/>
-          <w:u w:val="single"/>
-          <w:lang w:val="es-ES_tradnl" w:eastAsia="es-ES_tradnl"/>
-        </w:rPr>
-      </w:r>
-      <w:r>
-        <w:rPr>
-          <w:rFonts w:ascii="Aptos" w:hAnsi="Aptos"/>
-          <w:sz w:val="25"/>
-          <w:szCs w:val="25"/>
-          <w:lang w:val="es-ES_tradnl" w:eastAsia="es-ES_tradnl"/>
-        </w:rPr>
-      </w:r>
-      <w:r>
-        <w:rPr>
-          <w:rFonts w:ascii="Aptos" w:hAnsi="Aptos"/>
-          <w:sz w:val="25"/>
-          <w:szCs w:val="25"/>
+          <w:b w:val="0"/>
+          <w:sz w:val="25"/>
+          <w:szCs w:val="25"/>
+          <w:u w:val="none"/>
+          <w:lang w:val="es-ES_tradnl" w:eastAsia="es-ES_tradnl"/>
+        </w:rPr>
+      </w:r>
+      <w:r>
+        <w:rPr>
+          <w:rFonts w:ascii="Aptos" w:hAnsi="Aptos"/>
+          <w:b w:val="0"/>
+          <w:sz w:val="25"/>
+          <w:szCs w:val="25"/>
+          <w:u w:val="none"/>
+          <w:lang w:val="es-ES_tradnl" w:eastAsia="es-ES_tradnl"/>
+        </w:rPr>
+      </w:r>
+      <w:r>
+        <w:rPr>
+          <w:rFonts w:ascii="Aptos" w:hAnsi="Aptos"/>
+          <w:b w:val="0"/>
+          <w:sz w:val="25"/>
+          <w:szCs w:val="25"/>
+          <w:u w:val="none"/>
           <w:lang w:val="es-ES_tradnl" w:eastAsia="es-ES_tradnl"/>
         </w:rPr>
       </w:r>
@@ -1208,89 +1251,105 @@
       <w:r>
         <w:rPr>
           <w:rFonts w:ascii="Aptos" w:hAnsi="Aptos" w:cs="Arial"/>
-          <w:b/>
-          <w:bCs/>
-          <w:sz w:val="25"/>
-          <w:szCs w:val="25"/>
+          <w:b w:val="0"/>
+          <w:bCs/>
+          <w:sz w:val="25"/>
+          <w:szCs w:val="25"/>
+          <w:u w:val="none"/>
           <w:lang w:val="es-ES_tradnl"/>
         </w:rPr>
       </w:r>
       <w:r>
         <w:rPr>
           <w:rFonts w:ascii="Aptos" w:hAnsi="Aptos" w:cs="Arial"/>
-          <w:b/>
-          <w:bCs/>
-          <w:sz w:val="25"/>
-          <w:szCs w:val="25"/>
+          <w:b w:val="0"/>
+          <w:bCs/>
+          <w:sz w:val="25"/>
+          <w:szCs w:val="25"/>
+          <w:u w:val="none"/>
           <w:lang w:val="es-ES_tradnl"/>
         </w:rPr>
       </w:r>
       <w:r>
         <w:rPr>
           <w:rFonts w:ascii="Aptos" w:hAnsi="Aptos" w:cs="Arial"/>
-          <w:b/>
-          <w:bCs/>
-          <w:sz w:val="25"/>
-          <w:szCs w:val="25"/>
+          <w:b w:val="0"/>
+          <w:bCs/>
+          <w:sz w:val="25"/>
+          <w:szCs w:val="25"/>
+          <w:u w:val="none"/>
           <w:lang w:val="es-UY"/>
         </w:rPr>
       </w:r>
       <w:r>
         <w:rPr>
           <w:rFonts w:ascii="Aptos" w:hAnsi="Aptos" w:cs="Arial"/>
-          <w:b/>
-          <w:bCs/>
-          <w:sz w:val="25"/>
-          <w:szCs w:val="25"/>
+          <w:b w:val="0"/>
+          <w:bCs/>
+          <w:sz w:val="25"/>
+          <w:szCs w:val="25"/>
+          <w:u w:val="none"/>
           <w:lang w:val="es-ES_tradnl"/>
         </w:rPr>
       </w:r>
       <w:r>
         <w:rPr>
           <w:rFonts w:ascii="Aptos" w:hAnsi="Aptos" w:cs="Arial"/>
-          <w:sz w:val="25"/>
-          <w:szCs w:val="25"/>
+          <w:b w:val="0"/>
+          <w:sz w:val="25"/>
+          <w:szCs w:val="25"/>
+          <w:u w:val="none"/>
           <w:lang w:val="es-ES_tradnl"/>
         </w:rPr>
       </w:r>
       <w:r>
         <w:rPr>
           <w:rFonts w:ascii="Aptos" w:hAnsi="Aptos" w:cs="Arial"/>
-          <w:sz w:val="25"/>
-          <w:szCs w:val="25"/>
+          <w:b w:val="0"/>
+          <w:sz w:val="25"/>
+          <w:szCs w:val="25"/>
+          <w:u w:val="none"/>
           <w:lang w:val="es-ES_tradnl"/>
         </w:rPr>
       </w:r>
       <w:r>
         <w:rPr>
           <w:rFonts w:ascii="Aptos" w:hAnsi="Aptos" w:cs="Arial"/>
-          <w:sz w:val="25"/>
-          <w:szCs w:val="25"/>
+          <w:b w:val="0"/>
+          <w:sz w:val="25"/>
+          <w:szCs w:val="25"/>
+          <w:u w:val="none"/>
           <w:lang w:val="es-ES_tradnl"/>
         </w:rPr>
       </w:r>
       <w:r>
         <w:rPr>
           <w:rFonts w:ascii="Aptos" w:hAnsi="Aptos" w:cs="Arial"/>
-          <w:sz w:val="25"/>
-          <w:szCs w:val="25"/>
+          <w:b w:val="0"/>
+          <w:sz w:val="25"/>
+          <w:szCs w:val="25"/>
+          <w:u w:val="none"/>
           <w:lang w:val="es-ES_tradnl"/>
         </w:rPr>
       </w:r>
       <w:r>
         <w:rPr>
           <w:rFonts w:ascii="Aptos" w:hAnsi="Aptos" w:cs="Arial"/>
-          <w:bCs/>
-          <w:sz w:val="25"/>
-          <w:szCs w:val="25"/>
+          <w:b w:val="0"/>
+          <w:bCs/>
+          <w:sz w:val="25"/>
+          <w:szCs w:val="25"/>
+          <w:u w:val="none"/>
           <w:lang w:val="es-UY"/>
         </w:rPr>
       </w:r>
       <w:r>
         <w:rPr>
           <w:rFonts w:ascii="Aptos" w:hAnsi="Aptos" w:cs="Arial"/>
-          <w:sz w:val="25"/>
-          <w:szCs w:val="25"/>
+          <w:b w:val="0"/>
+          <w:sz w:val="25"/>
+          <w:szCs w:val="25"/>
+          <w:u w:val="none"/>
           <w:lang w:val="es-ES_tradnl"/>
         </w:rPr>
       </w:r>
@@ -1298,41 +1357,51 @@
       <w:r>
         <w:rPr>
           <w:rFonts w:ascii="Aptos" w:hAnsi="Aptos"/>
-          <w:sz w:val="25"/>
-          <w:szCs w:val="25"/>
+          <w:b w:val="0"/>
+          <w:sz w:val="25"/>
+          <w:szCs w:val="25"/>
+          <w:u w:val="none"/>
           <w:lang w:eastAsia="es-ES_tradnl"/>
         </w:rPr>
       </w:r>
       <w:r>
         <w:rPr>
           <w:rFonts w:ascii="Aptos" w:hAnsi="Aptos"/>
-          <w:sz w:val="25"/>
-          <w:szCs w:val="25"/>
-          <w:lang w:val="es-ES_tradnl" w:eastAsia="es-ES_tradnl"/>
-        </w:rPr>
-      </w:r>
-      <w:r>
-        <w:rPr>
-          <w:rFonts w:ascii="Aptos" w:hAnsi="Aptos"/>
-          <w:sz w:val="25"/>
-          <w:szCs w:val="25"/>
-          <w:lang w:val="es-ES_tradnl" w:eastAsia="es-ES_tradnl"/>
-        </w:rPr>
-      </w:r>
-      <w:r>
-        <w:rPr>
-          <w:rFonts w:ascii="Aptos" w:hAnsi="Aptos"/>
-          <w:sz w:val="25"/>
-          <w:szCs w:val="25"/>
-          <w:lang w:val="es-ES_tradnl" w:eastAsia="es-ES_tradnl"/>
-        </w:rPr>
-      </w:r>
-      <w:r>
-        <w:rPr>
-          <w:rFonts w:ascii="Aptos" w:hAnsi="Aptos"/>
-          <w:bCs/>
-          <w:sz w:val="25"/>
-          <w:szCs w:val="25"/>
+          <w:b w:val="0"/>
+          <w:sz w:val="25"/>
+          <w:szCs w:val="25"/>
+          <w:u w:val="none"/>
+          <w:lang w:val="es-ES_tradnl" w:eastAsia="es-ES_tradnl"/>
+        </w:rPr>
+      </w:r>
+      <w:r>
+        <w:rPr>
+          <w:rFonts w:ascii="Aptos" w:hAnsi="Aptos"/>
+          <w:b w:val="0"/>
+          <w:sz w:val="25"/>
+          <w:szCs w:val="25"/>
+          <w:u w:val="none"/>
+          <w:lang w:val="es-ES_tradnl" w:eastAsia="es-ES_tradnl"/>
+        </w:rPr>
+      </w:r>
+      <w:r>
+        <w:rPr>
+          <w:rFonts w:ascii="Aptos" w:hAnsi="Aptos"/>
+          <w:b w:val="0"/>
+          <w:sz w:val="25"/>
+          <w:szCs w:val="25"/>
+          <w:u w:val="none"/>
+          <w:lang w:val="es-ES_tradnl" w:eastAsia="es-ES_tradnl"/>
+        </w:rPr>
+      </w:r>
+      <w:r>
+        <w:rPr>
+          <w:rFonts w:ascii="Aptos" w:hAnsi="Aptos"/>
+          <w:b w:val="0"/>
+          <w:bCs/>
+          <w:sz w:val="25"/>
+          <w:szCs w:val="25"/>
+          <w:u w:val="none"/>
           <w:lang w:eastAsia="es-ES_tradnl"/>
         </w:rPr>
       </w:r>
@@ -1340,9 +1409,11 @@
       <w:r>
         <w:rPr>
           <w:rFonts w:ascii="Aptos" w:hAnsi="Aptos"/>
-          <w:bCs/>
-          <w:sz w:val="25"/>
-          <w:szCs w:val="25"/>
+          <w:b w:val="0"/>
+          <w:bCs/>
+          <w:sz w:val="25"/>
+          <w:szCs w:val="25"/>
+          <w:u w:val="none"/>
           <w:lang w:eastAsia="es-ES_tradnl"/>
         </w:rPr>
       </w:r>
@@ -1350,178 +1421,224 @@
       <w:r>
         <w:rPr>
           <w:rFonts w:ascii="Aptos" w:hAnsi="Aptos"/>
-          <w:bCs/>
-          <w:sz w:val="25"/>
-          <w:szCs w:val="25"/>
+          <w:b w:val="0"/>
+          <w:bCs/>
+          <w:sz w:val="25"/>
+          <w:szCs w:val="25"/>
+          <w:u w:val="none"/>
           <w:lang w:eastAsia="es-ES_tradnl"/>
         </w:rPr>
       </w:r>
       <w:r>
         <w:rPr>
           <w:rFonts w:ascii="Aptos" w:hAnsi="Aptos"/>
-          <w:sz w:val="25"/>
-          <w:szCs w:val="25"/>
-          <w:lang w:val="es-ES_tradnl" w:eastAsia="es-ES_tradnl"/>
-        </w:rPr>
-      </w:r>
-      <w:r>
-        <w:rPr>
-          <w:rFonts w:ascii="Aptos" w:hAnsi="Aptos" w:cs="Arial"/>
-          <w:sz w:val="25"/>
-          <w:szCs w:val="25"/>
-        </w:rPr>
-      </w:r>
-      <w:r>
-        <w:rPr>
-          <w:rFonts w:ascii="Aptos" w:hAnsi="Aptos" w:cs="Arial"/>
-          <w:sz w:val="25"/>
-          <w:szCs w:val="25"/>
-        </w:rPr>
-      </w:r>
-      <w:r>
-        <w:rPr>
-          <w:rFonts w:ascii="Aptos" w:hAnsi="Aptos" w:cs="Arial"/>
-          <w:sz w:val="25"/>
-          <w:szCs w:val="25"/>
-        </w:rPr>
-      </w:r>
-      <w:r>
-        <w:rPr>
-          <w:rFonts w:ascii="Aptos" w:hAnsi="Aptos" w:cs="Arial"/>
-          <w:sz w:val="25"/>
-          <w:szCs w:val="25"/>
-        </w:rPr>
-      </w:r>
-      <w:r>
-        <w:rPr>
-          <w:rFonts w:ascii="Aptos" w:hAnsi="Aptos" w:cs="Arial"/>
-          <w:sz w:val="25"/>
-          <w:szCs w:val="25"/>
-        </w:rPr>
-      </w:r>
-      <w:r>
-        <w:rPr>
-          <w:rFonts w:ascii="Aptos" w:hAnsi="Aptos" w:cs="Arial"/>
-          <w:sz w:val="25"/>
-          <w:szCs w:val="25"/>
-        </w:rPr>
-      </w:r>
-      <w:r>
-        <w:rPr>
-          <w:rFonts w:ascii="Aptos" w:hAnsi="Aptos" w:cs="Arial"/>
-          <w:sz w:val="25"/>
-          <w:szCs w:val="25"/>
-        </w:rPr>
-      </w:r>
-      <w:r>
-        <w:rPr>
-          <w:rFonts w:ascii="Aptos" w:hAnsi="Aptos" w:cs="Arial"/>
-          <w:sz w:val="25"/>
-          <w:szCs w:val="25"/>
-        </w:rPr>
-      </w:r>
-      <w:r>
-        <w:rPr>
-          <w:rFonts w:ascii="Aptos" w:hAnsi="Aptos" w:cs="Arial"/>
-          <w:sz w:val="25"/>
-          <w:szCs w:val="25"/>
-        </w:rPr>
-      </w:r>
-      <w:r>
-        <w:rPr>
-          <w:rFonts w:ascii="Aptos" w:hAnsi="Aptos" w:cs="Arial"/>
-          <w:sz w:val="25"/>
-          <w:szCs w:val="25"/>
-        </w:rPr>
-      </w:r>
-      <w:r>
-        <w:rPr>
-          <w:rFonts w:ascii="Aptos" w:hAnsi="Aptos" w:cs="Arial"/>
-          <w:sz w:val="25"/>
-          <w:szCs w:val="25"/>
-        </w:rPr>
-      </w:r>
-      <w:r>
-        <w:rPr>
-          <w:rFonts w:ascii="Aptos" w:hAnsi="Aptos" w:cs="Arial"/>
-          <w:sz w:val="25"/>
-          <w:szCs w:val="25"/>
-        </w:rPr>
-      </w:r>
-      <w:r>
-        <w:rPr>
-          <w:rFonts w:ascii="Aptos" w:hAnsi="Aptos"/>
-          <w:sz w:val="25"/>
-          <w:szCs w:val="25"/>
-          <w:lang w:val="es-ES_tradnl" w:eastAsia="es-ES_tradnl"/>
-        </w:rPr>
-      </w:r>
-      <w:r>
-        <w:rPr>
-          <w:rFonts w:ascii="Aptos" w:hAnsi="Aptos"/>
-          <w:bCs/>
-          <w:sz w:val="25"/>
-          <w:szCs w:val="25"/>
+          <w:b w:val="0"/>
+          <w:sz w:val="25"/>
+          <w:szCs w:val="25"/>
+          <w:u w:val="none"/>
+          <w:lang w:val="es-ES_tradnl" w:eastAsia="es-ES_tradnl"/>
+        </w:rPr>
+      </w:r>
+      <w:r>
+        <w:rPr>
+          <w:rFonts w:ascii="Aptos" w:hAnsi="Aptos" w:cs="Arial"/>
+          <w:b w:val="0"/>
+          <w:sz w:val="25"/>
+          <w:szCs w:val="25"/>
+          <w:u w:val="none"/>
+        </w:rPr>
+      </w:r>
+      <w:r>
+        <w:rPr>
+          <w:rFonts w:ascii="Aptos" w:hAnsi="Aptos" w:cs="Arial"/>
+          <w:b w:val="0"/>
+          <w:sz w:val="25"/>
+          <w:szCs w:val="25"/>
+          <w:u w:val="none"/>
+        </w:rPr>
+      </w:r>
+      <w:r>
+        <w:rPr>
+          <w:rFonts w:ascii="Aptos" w:hAnsi="Aptos" w:cs="Arial"/>
+          <w:b w:val="0"/>
+          <w:sz w:val="25"/>
+          <w:szCs w:val="25"/>
+          <w:u w:val="none"/>
+        </w:rPr>
+      </w:r>
+      <w:r>
+        <w:rPr>
+          <w:rFonts w:ascii="Aptos" w:hAnsi="Aptos" w:cs="Arial"/>
+          <w:b w:val="0"/>
+          <w:sz w:val="25"/>
+          <w:szCs w:val="25"/>
+          <w:u w:val="none"/>
+        </w:rPr>
+      </w:r>
+      <w:r>
+        <w:rPr>
+          <w:rFonts w:ascii="Aptos" w:hAnsi="Aptos" w:cs="Arial"/>
+          <w:b w:val="0"/>
+          <w:sz w:val="25"/>
+          <w:szCs w:val="25"/>
+          <w:u w:val="none"/>
+        </w:rPr>
+      </w:r>
+      <w:r>
+        <w:rPr>
+          <w:rFonts w:ascii="Aptos" w:hAnsi="Aptos" w:cs="Arial"/>
+          <w:b w:val="0"/>
+          <w:sz w:val="25"/>
+          <w:szCs w:val="25"/>
+          <w:u w:val="none"/>
+        </w:rPr>
+      </w:r>
+      <w:r>
+        <w:rPr>
+          <w:rFonts w:ascii="Aptos" w:hAnsi="Aptos" w:cs="Arial"/>
+          <w:b w:val="0"/>
+          <w:sz w:val="25"/>
+          <w:szCs w:val="25"/>
+          <w:u w:val="none"/>
+        </w:rPr>
+      </w:r>
+      <w:r>
+        <w:rPr>
+          <w:rFonts w:ascii="Aptos" w:hAnsi="Aptos" w:cs="Arial"/>
+          <w:b w:val="0"/>
+          <w:sz w:val="25"/>
+          <w:szCs w:val="25"/>
+          <w:u w:val="none"/>
+        </w:rPr>
+      </w:r>
+      <w:r>
+        <w:rPr>
+          <w:rFonts w:ascii="Aptos" w:hAnsi="Aptos" w:cs="Arial"/>
+          <w:b w:val="0"/>
+          <w:sz w:val="25"/>
+          <w:szCs w:val="25"/>
+          <w:u w:val="none"/>
+        </w:rPr>
+      </w:r>
+      <w:r>
+        <w:rPr>
+          <w:rFonts w:ascii="Aptos" w:hAnsi="Aptos" w:cs="Arial"/>
+          <w:b w:val="0"/>
+          <w:sz w:val="25"/>
+          <w:szCs w:val="25"/>
+          <w:u w:val="none"/>
+        </w:rPr>
+      </w:r>
+      <w:r>
+        <w:rPr>
+          <w:rFonts w:ascii="Aptos" w:hAnsi="Aptos" w:cs="Arial"/>
+          <w:b w:val="0"/>
+          <w:sz w:val="25"/>
+          <w:szCs w:val="25"/>
+          <w:u w:val="none"/>
+        </w:rPr>
+      </w:r>
+      <w:r>
+        <w:rPr>
+          <w:rFonts w:ascii="Aptos" w:hAnsi="Aptos" w:cs="Arial"/>
+          <w:b w:val="0"/>
+          <w:sz w:val="25"/>
+          <w:szCs w:val="25"/>
+          <w:u w:val="none"/>
+        </w:rPr>
+      </w:r>
+      <w:r>
+        <w:rPr>
+          <w:rFonts w:ascii="Aptos" w:hAnsi="Aptos"/>
+          <w:b w:val="0"/>
+          <w:sz w:val="25"/>
+          <w:szCs w:val="25"/>
+          <w:u w:val="none"/>
+          <w:lang w:val="es-ES_tradnl" w:eastAsia="es-ES_tradnl"/>
+        </w:rPr>
+      </w:r>
+      <w:r>
+        <w:rPr>
+          <w:rFonts w:ascii="Aptos" w:hAnsi="Aptos"/>
+          <w:b w:val="0"/>
+          <w:bCs/>
+          <w:sz w:val="25"/>
+          <w:szCs w:val="25"/>
+          <w:u w:val="none"/>
           <w:lang w:val="es-UY" w:eastAsia="es-ES_tradnl"/>
         </w:rPr>
       </w:r>
       <w:r>
         <w:rPr>
           <w:rFonts w:ascii="Aptos" w:hAnsi="Aptos"/>
-          <w:bCs/>
-          <w:sz w:val="25"/>
-          <w:szCs w:val="25"/>
+          <w:b w:val="0"/>
+          <w:bCs/>
+          <w:sz w:val="25"/>
+          <w:szCs w:val="25"/>
+          <w:u w:val="none"/>
           <w:lang w:val="es-UY" w:eastAsia="es-ES_tradnl"/>
         </w:rPr>
       </w:r>
       <w:r>
         <w:rPr>
           <w:rFonts w:ascii="Aptos" w:hAnsi="Aptos"/>
-          <w:bCs/>
-          <w:sz w:val="25"/>
-          <w:szCs w:val="25"/>
+          <w:b w:val="0"/>
+          <w:bCs/>
+          <w:sz w:val="25"/>
+          <w:szCs w:val="25"/>
+          <w:u w:val="none"/>
           <w:lang w:val="es-UY" w:eastAsia="es-ES_tradnl"/>
         </w:rPr>
       </w:r>
       <w:r>
         <w:rPr>
           <w:rFonts w:ascii="Aptos" w:hAnsi="Aptos"/>
-          <w:bCs/>
-          <w:sz w:val="25"/>
-          <w:szCs w:val="25"/>
+          <w:b w:val="0"/>
+          <w:bCs/>
+          <w:sz w:val="25"/>
+          <w:szCs w:val="25"/>
+          <w:u w:val="none"/>
           <w:lang w:val="es-UY" w:eastAsia="es-ES_tradnl"/>
         </w:rPr>
       </w:r>
       <w:r>
         <w:rPr>
           <w:rFonts w:ascii="Aptos" w:hAnsi="Aptos"/>
-          <w:bCs/>
-          <w:sz w:val="25"/>
-          <w:szCs w:val="25"/>
+          <w:b w:val="0"/>
+          <w:bCs/>
+          <w:sz w:val="25"/>
+          <w:szCs w:val="25"/>
+          <w:u w:val="none"/>
           <w:lang w:val="es-UY" w:eastAsia="es-ES_tradnl"/>
         </w:rPr>
       </w:r>
       <w:r>
         <w:rPr>
           <w:rFonts w:ascii="Aptos" w:hAnsi="Aptos" w:cs="Arial"/>
-          <w:sz w:val="25"/>
-          <w:szCs w:val="25"/>
+          <w:b w:val="0"/>
+          <w:sz w:val="25"/>
+          <w:szCs w:val="25"/>
+          <w:u w:val="none"/>
           <w:lang w:val="es-UY"/>
         </w:rPr>
       </w:r>
       <w:r>
         <w:rPr>
           <w:rFonts w:ascii="Aptos" w:hAnsi="Aptos"/>
-          <w:sz w:val="25"/>
-          <w:szCs w:val="25"/>
+          <w:b w:val="0"/>
+          <w:sz w:val="25"/>
+          <w:szCs w:val="25"/>
+          <w:u w:val="none"/>
           <w:lang w:eastAsia="es-ES_tradnl"/>
         </w:rPr>
       </w:r>
       <w:r>
         <w:rPr>
           <w:rFonts w:ascii="Aptos" w:hAnsi="Aptos"/>
-          <w:sz w:val="25"/>
-          <w:szCs w:val="25"/>
+          <w:b w:val="0"/>
+          <w:sz w:val="25"/>
+          <w:szCs w:val="25"/>
+          <w:u w:val="none"/>
           <w:lang w:val="es-ES_tradnl" w:eastAsia="es-ES_tradnl"/>
         </w:rPr>
       </w:r>
@@ -1529,8 +1646,10 @@
       <w:r>
         <w:rPr>
           <w:rFonts w:ascii="Aptos" w:hAnsi="Aptos"/>
-          <w:sz w:val="25"/>
-          <w:szCs w:val="25"/>
+          <w:b w:val="0"/>
+          <w:sz w:val="25"/>
+          <w:szCs w:val="25"/>
+          <w:u w:val="none"/>
           <w:lang w:val="es-ES_tradnl" w:eastAsia="es-ES_tradnl"/>
         </w:rPr>
       </w:r>
@@ -1538,8 +1657,10 @@
       <w:r>
         <w:rPr>
           <w:rFonts w:ascii="Aptos" w:hAnsi="Aptos"/>
-          <w:sz w:val="25"/>
-          <w:szCs w:val="25"/>
+          <w:b w:val="0"/>
+          <w:sz w:val="25"/>
+          <w:szCs w:val="25"/>
+          <w:u w:val="none"/>
           <w:lang w:val="es-ES_tradnl" w:eastAsia="es-ES_tradnl"/>
         </w:rPr>
       </w:r>
@@ -1547,8 +1668,10 @@
       <w:r>
         <w:rPr>
           <w:rFonts w:ascii="Aptos" w:hAnsi="Aptos"/>
-          <w:sz w:val="25"/>
-          <w:szCs w:val="25"/>
+          <w:b w:val="0"/>
+          <w:sz w:val="25"/>
+          <w:szCs w:val="25"/>
+          <w:u w:val="none"/>
           <w:lang w:val="es-ES_tradnl" w:eastAsia="es-ES_tradnl"/>
         </w:rPr>
       </w:r>
@@ -1556,52 +1679,62 @@
       <w:r>
         <w:rPr>
           <w:rFonts w:ascii="Aptos" w:hAnsi="Aptos"/>
-          <w:sz w:val="25"/>
-          <w:szCs w:val="25"/>
-          <w:lang w:val="es-ES_tradnl" w:eastAsia="es-ES_tradnl"/>
-        </w:rPr>
-      </w:r>
-      <w:r>
-        <w:rPr>
-          <w:rFonts w:ascii="Aptos" w:hAnsi="Aptos"/>
-          <w:b/>
-          <w:bCs/>
-          <w:sz w:val="25"/>
-          <w:szCs w:val="25"/>
-          <w:lang w:val="es-ES_tradnl" w:eastAsia="es-ES_tradnl"/>
-        </w:rPr>
-      </w:r>
-      <w:r>
-        <w:rPr>
-          <w:rFonts w:ascii="Aptos" w:hAnsi="Aptos"/>
-          <w:sz w:val="25"/>
-          <w:szCs w:val="25"/>
-          <w:lang w:val="es-ES_tradnl" w:eastAsia="es-ES_tradnl"/>
-        </w:rPr>
-      </w:r>
-      <w:r>
-        <w:rPr>
-          <w:rFonts w:ascii="Aptos" w:hAnsi="Aptos"/>
-          <w:sz w:val="25"/>
-          <w:szCs w:val="25"/>
-          <w:lang w:val="es-ES_tradnl" w:eastAsia="es-ES_tradnl"/>
-        </w:rPr>
-      </w:r>
-      <w:r>
-        <w:rPr>
-          <w:rFonts w:ascii="Aptos" w:hAnsi="Aptos"/>
-          <w:sz w:val="25"/>
-          <w:szCs w:val="25"/>
-          <w:lang w:val="es-ES_tradnl" w:eastAsia="es-ES_tradnl"/>
-        </w:rPr>
-      </w:r>
-      <w:r>
-        <w:rPr>
-          <w:rFonts w:ascii="Aptos" w:hAnsi="Aptos"/>
-          <w:b/>
-          <w:bCs/>
-          <w:sz w:val="25"/>
-          <w:szCs w:val="25"/>
+          <w:b w:val="0"/>
+          <w:sz w:val="25"/>
+          <w:szCs w:val="25"/>
+          <w:u w:val="none"/>
+          <w:lang w:val="es-ES_tradnl" w:eastAsia="es-ES_tradnl"/>
+        </w:rPr>
+      </w:r>
+      <w:r>
+        <w:rPr>
+          <w:rFonts w:ascii="Aptos" w:hAnsi="Aptos"/>
+          <w:b w:val="0"/>
+          <w:bCs/>
+          <w:sz w:val="25"/>
+          <w:szCs w:val="25"/>
+          <w:u w:val="none"/>
+          <w:lang w:val="es-ES_tradnl" w:eastAsia="es-ES_tradnl"/>
+        </w:rPr>
+      </w:r>
+      <w:r>
+        <w:rPr>
+          <w:rFonts w:ascii="Aptos" w:hAnsi="Aptos"/>
+          <w:b w:val="0"/>
+          <w:sz w:val="25"/>
+          <w:szCs w:val="25"/>
+          <w:u w:val="none"/>
+          <w:lang w:val="es-ES_tradnl" w:eastAsia="es-ES_tradnl"/>
+        </w:rPr>
+      </w:r>
+      <w:r>
+        <w:rPr>
+          <w:rFonts w:ascii="Aptos" w:hAnsi="Aptos"/>
+          <w:b w:val="0"/>
+          <w:sz w:val="25"/>
+          <w:szCs w:val="25"/>
+          <w:u w:val="none"/>
+          <w:lang w:val="es-ES_tradnl" w:eastAsia="es-ES_tradnl"/>
+        </w:rPr>
+      </w:r>
+      <w:r>
+        <w:rPr>
+          <w:rFonts w:ascii="Aptos" w:hAnsi="Aptos"/>
+          <w:b w:val="0"/>
+          <w:sz w:val="25"/>
+          <w:szCs w:val="25"/>
+          <w:u w:val="none"/>
+          <w:lang w:val="es-ES_tradnl" w:eastAsia="es-ES_tradnl"/>
+        </w:rPr>
+      </w:r>
+      <w:r>
+        <w:rPr>
+          <w:rFonts w:ascii="Aptos" w:hAnsi="Aptos"/>
+          <w:b w:val="0"/>
+          <w:bCs/>
+          <w:sz w:val="25"/>
+          <w:szCs w:val="25"/>
+          <w:u w:val="none"/>
           <w:lang w:val="es-ES_tradnl" w:eastAsia="es-ES_tradnl"/>
         </w:rPr>
       </w:r>
@@ -1623,11 +1756,11 @@
       <w:r>
         <w:rPr>
           <w:rFonts w:ascii="Aptos" w:eastAsia="Times New Roman" w:hAnsi="Aptos"/>
-          <w:b/>
+          <w:b w:val="0"/>
           <w:iCs/>
           <w:sz w:val="25"/>
           <w:szCs w:val="25"/>
-          <w:u w:val="single"/>
+          <w:u w:val="none"/>
           <w:lang w:val="es-ES_tradnl" w:eastAsia="es-ES_tradnl"/>
         </w:rPr>
         <w:t>{protocolizacion_texto}</w:t>
@@ -1636,62 +1769,64 @@
       <w:r>
         <w:rPr>
           <w:rFonts w:ascii="Aptos" w:eastAsia="Times New Roman" w:hAnsi="Aptos"/>
-          <w:b/>
+          <w:b w:val="0"/>
           <w:iCs/>
           <w:sz w:val="25"/>
           <w:szCs w:val="25"/>
-          <w:u w:val="single"/>
-          <w:lang w:val="es-ES_tradnl" w:eastAsia="es-ES_tradnl"/>
-        </w:rPr>
-      </w:r>
-      <w:r>
-        <w:rPr>
-          <w:rFonts w:ascii="Aptos" w:eastAsia="Times New Roman" w:hAnsi="Aptos"/>
-          <w:b/>
+          <w:u w:val="none"/>
+          <w:lang w:val="es-ES_tradnl" w:eastAsia="es-ES_tradnl"/>
+        </w:rPr>
+      </w:r>
+      <w:r>
+        <w:rPr>
+          <w:rFonts w:ascii="Aptos" w:eastAsia="Times New Roman" w:hAnsi="Aptos"/>
+          <w:b w:val="0"/>
           <w:iCs/>
           <w:sz w:val="25"/>
           <w:szCs w:val="25"/>
-          <w:u w:val="single"/>
-          <w:lang w:val="es-ES_tradnl" w:eastAsia="es-ES_tradnl"/>
-        </w:rPr>
-      </w:r>
-      <w:r>
-        <w:rPr>
-          <w:rFonts w:ascii="Aptos" w:eastAsia="Times New Roman" w:hAnsi="Aptos"/>
-          <w:b/>
+          <w:u w:val="none"/>
+          <w:lang w:val="es-ES_tradnl" w:eastAsia="es-ES_tradnl"/>
+        </w:rPr>
+      </w:r>
+      <w:r>
+        <w:rPr>
+          <w:rFonts w:ascii="Aptos" w:eastAsia="Times New Roman" w:hAnsi="Aptos"/>
+          <w:b w:val="0"/>
           <w:iCs/>
           <w:sz w:val="25"/>
           <w:szCs w:val="25"/>
-          <w:u w:val="single"/>
+          <w:u w:val="none"/>
           <w:lang w:val="es-ES_tradnl" w:eastAsia="es-ES_tradnl"/>
         </w:rPr>
       </w:r>
       <w:r>
         <w:rPr>
           <w:rFonts w:ascii="Aptos" w:eastAsia="Times New Roman" w:hAnsi="Aptos" w:cs="Arial"/>
-          <w:b/>
-          <w:sz w:val="25"/>
-          <w:szCs w:val="25"/>
-          <w:u w:val="single"/>
+          <w:b w:val="0"/>
+          <w:sz w:val="25"/>
+          <w:szCs w:val="25"/>
+          <w:u w:val="none"/>
           <w:lang w:eastAsia="es-ES"/>
         </w:rPr>
       </w:r>
       <w:r>
         <w:rPr>
           <w:rFonts w:ascii="Aptos" w:eastAsia="Times New Roman" w:hAnsi="Aptos" w:cs="Arial"/>
-          <w:b/>
-          <w:sz w:val="25"/>
-          <w:szCs w:val="25"/>
+          <w:b w:val="0"/>
+          <w:sz w:val="25"/>
+          <w:szCs w:val="25"/>
+          <w:u w:val="none"/>
           <w:lang w:eastAsia="es-ES"/>
         </w:rPr>
       </w:r>
       <w:r>
         <w:rPr>
           <w:rFonts w:ascii="Aptos" w:eastAsia="Times New Roman" w:hAnsi="Aptos" w:cs="Arial"/>
-          <w:b/>
-          <w:bCs/>
-          <w:sz w:val="25"/>
-          <w:szCs w:val="25"/>
+          <w:b w:val="0"/>
+          <w:bCs/>
+          <w:sz w:val="25"/>
+          <w:szCs w:val="25"/>
+          <w:u w:val="none"/>
           <w:lang w:eastAsia="es-ES"/>
         </w:rPr>
       </w:r>
@@ -1699,10 +1834,11 @@
       <w:r>
         <w:rPr>
           <w:rFonts w:ascii="Aptos" w:eastAsia="Times New Roman" w:hAnsi="Aptos" w:cs="Arial"/>
-          <w:b/>
-          <w:bCs/>
-          <w:sz w:val="25"/>
-          <w:szCs w:val="25"/>
+          <w:b w:val="0"/>
+          <w:bCs/>
+          <w:sz w:val="25"/>
+          <w:szCs w:val="25"/>
+          <w:u w:val="none"/>
           <w:lang w:eastAsia="es-ES"/>
         </w:rPr>
       </w:r>
@@ -1710,161 +1846,192 @@
       <w:r>
         <w:rPr>
           <w:rFonts w:ascii="Aptos" w:hAnsi="Aptos" w:cs="Arial"/>
-          <w:b/>
-          <w:sz w:val="25"/>
-          <w:szCs w:val="25"/>
-        </w:rPr>
-      </w:r>
-      <w:r>
-        <w:rPr>
-          <w:rFonts w:ascii="Aptos" w:eastAsia="Times New Roman" w:hAnsi="Aptos"/>
-          <w:b/>
+          <w:b w:val="0"/>
+          <w:sz w:val="25"/>
+          <w:szCs w:val="25"/>
+          <w:u w:val="none"/>
+        </w:rPr>
+      </w:r>
+      <w:r>
+        <w:rPr>
+          <w:rFonts w:ascii="Aptos" w:eastAsia="Times New Roman" w:hAnsi="Aptos"/>
+          <w:b w:val="0"/>
           <w:iCs/>
           <w:sz w:val="25"/>
           <w:szCs w:val="25"/>
-          <w:lang w:val="es-ES_tradnl" w:eastAsia="es-ES_tradnl"/>
-        </w:rPr>
-      </w:r>
-      <w:r>
-        <w:rPr>
-          <w:rFonts w:ascii="Aptos" w:eastAsia="Times New Roman" w:hAnsi="Aptos"/>
+          <w:u w:val="none"/>
+          <w:lang w:val="es-ES_tradnl" w:eastAsia="es-ES_tradnl"/>
+        </w:rPr>
+      </w:r>
+      <w:r>
+        <w:rPr>
+          <w:rFonts w:ascii="Aptos" w:eastAsia="Times New Roman" w:hAnsi="Aptos"/>
+          <w:b w:val="0"/>
           <w:iCs/>
           <w:sz w:val="25"/>
           <w:szCs w:val="25"/>
-          <w:lang w:val="es-ES_tradnl" w:eastAsia="es-ES_tradnl"/>
-        </w:rPr>
-      </w:r>
-      <w:r>
-        <w:rPr>
-          <w:rFonts w:ascii="Aptos" w:eastAsia="Times New Roman" w:hAnsi="Aptos"/>
+          <w:u w:val="none"/>
+          <w:lang w:val="es-ES_tradnl" w:eastAsia="es-ES_tradnl"/>
+        </w:rPr>
+      </w:r>
+      <w:r>
+        <w:rPr>
+          <w:rFonts w:ascii="Aptos" w:eastAsia="Times New Roman" w:hAnsi="Aptos"/>
+          <w:b w:val="0"/>
           <w:iCs/>
           <w:sz w:val="25"/>
           <w:szCs w:val="25"/>
-          <w:lang w:val="es-ES_tradnl" w:eastAsia="es-ES_tradnl"/>
-        </w:rPr>
-      </w:r>
-      <w:r>
-        <w:rPr>
-          <w:rFonts w:ascii="Aptos" w:eastAsia="Times New Roman" w:hAnsi="Aptos"/>
+          <w:u w:val="none"/>
+          <w:lang w:val="es-ES_tradnl" w:eastAsia="es-ES_tradnl"/>
+        </w:rPr>
+      </w:r>
+      <w:r>
+        <w:rPr>
+          <w:rFonts w:ascii="Aptos" w:eastAsia="Times New Roman" w:hAnsi="Aptos"/>
+          <w:b w:val="0"/>
           <w:iCs/>
           <w:sz w:val="25"/>
           <w:szCs w:val="25"/>
-          <w:lang w:val="es-ES_tradnl" w:eastAsia="es-ES_tradnl"/>
-        </w:rPr>
-      </w:r>
-      <w:r>
-        <w:rPr>
-          <w:rFonts w:ascii="Aptos" w:hAnsi="Aptos" w:cs="Arial"/>
-          <w:b/>
-          <w:sz w:val="25"/>
-          <w:szCs w:val="25"/>
-        </w:rPr>
-      </w:r>
-      <w:r>
-        <w:rPr>
-          <w:rFonts w:ascii="Aptos" w:hAnsi="Aptos" w:cs="Arial"/>
-          <w:b/>
-          <w:sz w:val="25"/>
-          <w:szCs w:val="25"/>
-        </w:rPr>
-      </w:r>
-      <w:r>
-        <w:rPr>
-          <w:rFonts w:ascii="Aptos" w:eastAsia="Times New Roman" w:hAnsi="Aptos"/>
+          <w:u w:val="none"/>
+          <w:lang w:val="es-ES_tradnl" w:eastAsia="es-ES_tradnl"/>
+        </w:rPr>
+      </w:r>
+      <w:r>
+        <w:rPr>
+          <w:rFonts w:ascii="Aptos" w:hAnsi="Aptos" w:cs="Arial"/>
+          <w:b w:val="0"/>
+          <w:sz w:val="25"/>
+          <w:szCs w:val="25"/>
+          <w:u w:val="none"/>
+        </w:rPr>
+      </w:r>
+      <w:r>
+        <w:rPr>
+          <w:rFonts w:ascii="Aptos" w:hAnsi="Aptos" w:cs="Arial"/>
+          <w:b w:val="0"/>
+          <w:sz w:val="25"/>
+          <w:szCs w:val="25"/>
+          <w:u w:val="none"/>
+        </w:rPr>
+      </w:r>
+      <w:r>
+        <w:rPr>
+          <w:rFonts w:ascii="Aptos" w:eastAsia="Times New Roman" w:hAnsi="Aptos"/>
+          <w:b w:val="0"/>
           <w:iCs/>
           <w:sz w:val="25"/>
           <w:szCs w:val="25"/>
-          <w:lang w:val="es-ES_tradnl" w:eastAsia="es-ES_tradnl"/>
-        </w:rPr>
-      </w:r>
-      <w:r>
-        <w:rPr>
-          <w:rFonts w:ascii="Aptos" w:eastAsia="Times New Roman" w:hAnsi="Aptos"/>
+          <w:u w:val="none"/>
+          <w:lang w:val="es-ES_tradnl" w:eastAsia="es-ES_tradnl"/>
+        </w:rPr>
+      </w:r>
+      <w:r>
+        <w:rPr>
+          <w:rFonts w:ascii="Aptos" w:eastAsia="Times New Roman" w:hAnsi="Aptos"/>
+          <w:b w:val="0"/>
           <w:iCs/>
           <w:sz w:val="25"/>
           <w:szCs w:val="25"/>
-          <w:lang w:val="es-ES_tradnl" w:eastAsia="es-ES_tradnl"/>
-        </w:rPr>
-      </w:r>
-      <w:r>
-        <w:rPr>
-          <w:rFonts w:ascii="Aptos" w:eastAsia="Times New Roman" w:hAnsi="Aptos"/>
+          <w:u w:val="none"/>
+          <w:lang w:val="es-ES_tradnl" w:eastAsia="es-ES_tradnl"/>
+        </w:rPr>
+      </w:r>
+      <w:r>
+        <w:rPr>
+          <w:rFonts w:ascii="Aptos" w:eastAsia="Times New Roman" w:hAnsi="Aptos"/>
+          <w:b w:val="0"/>
           <w:iCs/>
           <w:sz w:val="25"/>
           <w:szCs w:val="25"/>
-          <w:lang w:val="es-ES_tradnl" w:eastAsia="es-ES_tradnl"/>
-        </w:rPr>
-      </w:r>
-      <w:r>
-        <w:rPr>
-          <w:rFonts w:ascii="Aptos" w:eastAsia="Times New Roman" w:hAnsi="Aptos"/>
+          <w:u w:val="none"/>
+          <w:lang w:val="es-ES_tradnl" w:eastAsia="es-ES_tradnl"/>
+        </w:rPr>
+      </w:r>
+      <w:r>
+        <w:rPr>
+          <w:rFonts w:ascii="Aptos" w:eastAsia="Times New Roman" w:hAnsi="Aptos"/>
+          <w:b w:val="0"/>
           <w:iCs/>
           <w:sz w:val="25"/>
           <w:szCs w:val="25"/>
-          <w:lang w:val="es-ES_tradnl" w:eastAsia="es-ES_tradnl"/>
-        </w:rPr>
-      </w:r>
-      <w:r>
-        <w:rPr>
-          <w:rFonts w:ascii="Aptos" w:eastAsia="Times New Roman" w:hAnsi="Aptos"/>
+          <w:u w:val="none"/>
+          <w:lang w:val="es-ES_tradnl" w:eastAsia="es-ES_tradnl"/>
+        </w:rPr>
+      </w:r>
+      <w:r>
+        <w:rPr>
+          <w:rFonts w:ascii="Aptos" w:eastAsia="Times New Roman" w:hAnsi="Aptos"/>
+          <w:b w:val="0"/>
           <w:iCs/>
           <w:sz w:val="25"/>
           <w:szCs w:val="25"/>
-          <w:lang w:val="es-ES_tradnl" w:eastAsia="es-ES_tradnl"/>
-        </w:rPr>
-      </w:r>
-      <w:r>
-        <w:rPr>
-          <w:rFonts w:ascii="Aptos" w:eastAsia="Times New Roman" w:hAnsi="Aptos"/>
+          <w:u w:val="none"/>
+          <w:lang w:val="es-ES_tradnl" w:eastAsia="es-ES_tradnl"/>
+        </w:rPr>
+      </w:r>
+      <w:r>
+        <w:rPr>
+          <w:rFonts w:ascii="Aptos" w:eastAsia="Times New Roman" w:hAnsi="Aptos"/>
+          <w:b w:val="0"/>
           <w:iCs/>
           <w:sz w:val="25"/>
           <w:szCs w:val="25"/>
-          <w:lang w:val="es-ES_tradnl" w:eastAsia="es-ES_tradnl"/>
-        </w:rPr>
-      </w:r>
-      <w:r>
-        <w:rPr>
-          <w:rFonts w:ascii="Aptos" w:eastAsia="Times New Roman" w:hAnsi="Aptos"/>
+          <w:u w:val="none"/>
+          <w:lang w:val="es-ES_tradnl" w:eastAsia="es-ES_tradnl"/>
+        </w:rPr>
+      </w:r>
+      <w:r>
+        <w:rPr>
+          <w:rFonts w:ascii="Aptos" w:eastAsia="Times New Roman" w:hAnsi="Aptos"/>
+          <w:b w:val="0"/>
           <w:iCs/>
           <w:sz w:val="25"/>
           <w:szCs w:val="25"/>
-          <w:lang w:val="es-ES_tradnl" w:eastAsia="es-ES_tradnl"/>
-        </w:rPr>
-      </w:r>
-      <w:r>
-        <w:rPr>
-          <w:rFonts w:ascii="Aptos" w:eastAsia="Times New Roman" w:hAnsi="Aptos"/>
+          <w:u w:val="none"/>
+          <w:lang w:val="es-ES_tradnl" w:eastAsia="es-ES_tradnl"/>
+        </w:rPr>
+      </w:r>
+      <w:r>
+        <w:rPr>
+          <w:rFonts w:ascii="Aptos" w:eastAsia="Times New Roman" w:hAnsi="Aptos"/>
+          <w:b w:val="0"/>
           <w:iCs/>
           <w:sz w:val="25"/>
           <w:szCs w:val="25"/>
-          <w:lang w:val="es-ES_tradnl" w:eastAsia="es-ES_tradnl"/>
-        </w:rPr>
-      </w:r>
-      <w:r>
-        <w:rPr>
-          <w:rFonts w:ascii="Aptos" w:eastAsia="Times New Roman" w:hAnsi="Aptos"/>
+          <w:u w:val="none"/>
+          <w:lang w:val="es-ES_tradnl" w:eastAsia="es-ES_tradnl"/>
+        </w:rPr>
+      </w:r>
+      <w:r>
+        <w:rPr>
+          <w:rFonts w:ascii="Aptos" w:eastAsia="Times New Roman" w:hAnsi="Aptos"/>
+          <w:b w:val="0"/>
           <w:iCs/>
           <w:sz w:val="25"/>
           <w:szCs w:val="25"/>
-          <w:lang w:val="es-ES_tradnl" w:eastAsia="es-ES_tradnl"/>
-        </w:rPr>
-      </w:r>
-      <w:r>
-        <w:rPr>
-          <w:rFonts w:ascii="Aptos" w:eastAsia="Times New Roman" w:hAnsi="Aptos"/>
+          <w:u w:val="none"/>
+          <w:lang w:val="es-ES_tradnl" w:eastAsia="es-ES_tradnl"/>
+        </w:rPr>
+      </w:r>
+      <w:r>
+        <w:rPr>
+          <w:rFonts w:ascii="Aptos" w:eastAsia="Times New Roman" w:hAnsi="Aptos"/>
+          <w:b w:val="0"/>
           <w:iCs/>
           <w:sz w:val="25"/>
           <w:szCs w:val="25"/>
-          <w:lang w:val="es-ES_tradnl" w:eastAsia="es-ES_tradnl"/>
-        </w:rPr>
-      </w:r>
-      <w:r>
-        <w:rPr>
-          <w:rFonts w:ascii="Aptos" w:eastAsia="Times New Roman" w:hAnsi="Aptos"/>
-          <w:b/>
+          <w:u w:val="none"/>
+          <w:lang w:val="es-ES_tradnl" w:eastAsia="es-ES_tradnl"/>
+        </w:rPr>
+      </w:r>
+      <w:r>
+        <w:rPr>
+          <w:rFonts w:ascii="Aptos" w:eastAsia="Times New Roman" w:hAnsi="Aptos"/>
+          <w:b w:val="0"/>
           <w:iCs/>
           <w:sz w:val="25"/>
           <w:szCs w:val="25"/>
+          <w:u w:val="none"/>
           <w:lang w:val="es-ES_tradnl" w:eastAsia="es-ES_tradnl"/>
         </w:rPr>
       </w:r>
@@ -1884,10 +2051,10 @@
       <w:r>
         <w:rPr>
           <w:rFonts w:ascii="Aptos" w:eastAsia="Times New Roman" w:hAnsi="Aptos"/>
-          <w:b/>
-          <w:sz w:val="25"/>
-          <w:szCs w:val="25"/>
-          <w:u w:val="single"/>
+          <w:b w:val="0"/>
+          <w:sz w:val="25"/>
+          <w:szCs w:val="25"/>
+          <w:u w:val="none"/>
           <w:lang w:val="es-ES_tradnl" w:eastAsia="es-ES_tradnl"/>
         </w:rPr>
         <w:t>{primer_testimonio}</w:t>
@@ -1895,33 +2062,40 @@
       <w:r>
         <w:rPr>
           <w:rFonts w:ascii="Aptos" w:eastAsia="Times New Roman" w:hAnsi="Aptos"/>
-          <w:sz w:val="25"/>
-          <w:szCs w:val="25"/>
-          <w:u w:val="single"/>
-          <w:lang w:val="es-ES_tradnl" w:eastAsia="es-ES_tradnl"/>
-        </w:rPr>
-      </w:r>
-      <w:r>
-        <w:rPr>
-          <w:rFonts w:ascii="Aptos" w:eastAsia="Times New Roman" w:hAnsi="Aptos"/>
-          <w:sz w:val="25"/>
-          <w:szCs w:val="25"/>
-          <w:lang w:val="es-ES_tradnl" w:eastAsia="es-ES_tradnl"/>
-        </w:rPr>
-      </w:r>
-      <w:r>
-        <w:rPr>
-          <w:rFonts w:ascii="Aptos" w:eastAsia="Times New Roman" w:hAnsi="Aptos"/>
-          <w:sz w:val="25"/>
-          <w:szCs w:val="25"/>
-          <w:lang w:val="es-ES_tradnl" w:eastAsia="es-ES_tradnl"/>
-        </w:rPr>
-      </w:r>
-      <w:r>
-        <w:rPr>
-          <w:rFonts w:ascii="Aptos" w:eastAsia="Times New Roman" w:hAnsi="Aptos"/>
-          <w:sz w:val="25"/>
-          <w:szCs w:val="25"/>
+          <w:b w:val="0"/>
+          <w:sz w:val="25"/>
+          <w:szCs w:val="25"/>
+          <w:u w:val="none"/>
+          <w:lang w:val="es-ES_tradnl" w:eastAsia="es-ES_tradnl"/>
+        </w:rPr>
+      </w:r>
+      <w:r>
+        <w:rPr>
+          <w:rFonts w:ascii="Aptos" w:eastAsia="Times New Roman" w:hAnsi="Aptos"/>
+          <w:b w:val="0"/>
+          <w:sz w:val="25"/>
+          <w:szCs w:val="25"/>
+          <w:u w:val="none"/>
+          <w:lang w:val="es-ES_tradnl" w:eastAsia="es-ES_tradnl"/>
+        </w:rPr>
+      </w:r>
+      <w:r>
+        <w:rPr>
+          <w:rFonts w:ascii="Aptos" w:eastAsia="Times New Roman" w:hAnsi="Aptos"/>
+          <w:b w:val="0"/>
+          <w:sz w:val="25"/>
+          <w:szCs w:val="25"/>
+          <w:u w:val="none"/>
+          <w:lang w:val="es-ES_tradnl" w:eastAsia="es-ES_tradnl"/>
+        </w:rPr>
+      </w:r>
+      <w:r>
+        <w:rPr>
+          <w:rFonts w:ascii="Aptos" w:eastAsia="Times New Roman" w:hAnsi="Aptos"/>
+          <w:b w:val="0"/>
+          <w:sz w:val="25"/>
+          <w:szCs w:val="25"/>
+          <w:u w:val="none"/>
           <w:lang w:val="es-ES_tradnl" w:eastAsia="es-ES_tradnl"/>
         </w:rPr>
       </w:r>
@@ -1929,8 +2103,10 @@
       <w:r>
         <w:rPr>
           <w:rFonts w:ascii="Aptos" w:eastAsia="Times New Roman" w:hAnsi="Aptos"/>
-          <w:sz w:val="25"/>
-          <w:szCs w:val="25"/>
+          <w:b w:val="0"/>
+          <w:sz w:val="25"/>
+          <w:szCs w:val="25"/>
+          <w:u w:val="none"/>
           <w:lang w:val="es-ES_tradnl" w:eastAsia="es-ES_tradnl"/>
         </w:rPr>
       </w:r>
@@ -1938,57 +2114,70 @@
       <w:r>
         <w:rPr>
           <w:rFonts w:ascii="Aptos" w:eastAsia="Times New Roman" w:hAnsi="Aptos"/>
-          <w:sz w:val="25"/>
-          <w:szCs w:val="25"/>
-          <w:lang w:val="es-ES_tradnl" w:eastAsia="es-ES_tradnl"/>
-        </w:rPr>
-      </w:r>
-      <w:r>
-        <w:rPr>
-          <w:rFonts w:ascii="Aptos" w:eastAsia="Times New Roman" w:hAnsi="Aptos"/>
-          <w:sz w:val="25"/>
-          <w:szCs w:val="25"/>
-          <w:lang w:val="es-ES_tradnl" w:eastAsia="es-ES_tradnl"/>
-        </w:rPr>
-      </w:r>
-      <w:r>
-        <w:rPr>
-          <w:rFonts w:ascii="Aptos" w:eastAsia="Times New Roman" w:hAnsi="Aptos"/>
-          <w:sz w:val="25"/>
-          <w:szCs w:val="25"/>
-          <w:lang w:val="es-ES_tradnl" w:eastAsia="es-ES_tradnl"/>
-        </w:rPr>
-      </w:r>
-      <w:r>
-        <w:rPr>
-          <w:rFonts w:ascii="Aptos" w:eastAsia="Times New Roman" w:hAnsi="Aptos"/>
-          <w:b/>
-          <w:sz w:val="25"/>
-          <w:szCs w:val="25"/>
-          <w:lang w:val="es-ES_tradnl" w:eastAsia="es-ES_tradnl"/>
-        </w:rPr>
-      </w:r>
-      <w:r>
-        <w:rPr>
-          <w:rFonts w:ascii="Aptos" w:eastAsia="Times New Roman" w:hAnsi="Aptos"/>
-          <w:sz w:val="25"/>
-          <w:szCs w:val="25"/>
-          <w:lang w:val="es-ES_tradnl" w:eastAsia="es-ES_tradnl"/>
-        </w:rPr>
-      </w:r>
-      <w:r>
-        <w:rPr>
-          <w:rFonts w:ascii="Aptos" w:eastAsia="Times New Roman" w:hAnsi="Aptos"/>
-          <w:sz w:val="25"/>
-          <w:szCs w:val="25"/>
-          <w:lang w:val="es-ES_tradnl" w:eastAsia="es-ES_tradnl"/>
-        </w:rPr>
-      </w:r>
-      <w:r>
-        <w:rPr>
-          <w:rFonts w:ascii="Aptos" w:eastAsia="Times New Roman" w:hAnsi="Aptos"/>
-          <w:sz w:val="25"/>
-          <w:szCs w:val="25"/>
+          <w:b w:val="0"/>
+          <w:sz w:val="25"/>
+          <w:szCs w:val="25"/>
+          <w:u w:val="none"/>
+          <w:lang w:val="es-ES_tradnl" w:eastAsia="es-ES_tradnl"/>
+        </w:rPr>
+      </w:r>
+      <w:r>
+        <w:rPr>
+          <w:rFonts w:ascii="Aptos" w:eastAsia="Times New Roman" w:hAnsi="Aptos"/>
+          <w:b w:val="0"/>
+          <w:sz w:val="25"/>
+          <w:szCs w:val="25"/>
+          <w:u w:val="none"/>
+          <w:lang w:val="es-ES_tradnl" w:eastAsia="es-ES_tradnl"/>
+        </w:rPr>
+      </w:r>
+      <w:r>
+        <w:rPr>
+          <w:rFonts w:ascii="Aptos" w:eastAsia="Times New Roman" w:hAnsi="Aptos"/>
+          <w:b w:val="0"/>
+          <w:sz w:val="25"/>
+          <w:szCs w:val="25"/>
+          <w:u w:val="none"/>
+          <w:lang w:val="es-ES_tradnl" w:eastAsia="es-ES_tradnl"/>
+        </w:rPr>
+      </w:r>
+      <w:r>
+        <w:rPr>
+          <w:rFonts w:ascii="Aptos" w:eastAsia="Times New Roman" w:hAnsi="Aptos"/>
+          <w:b w:val="0"/>
+          <w:sz w:val="25"/>
+          <w:szCs w:val="25"/>
+          <w:u w:val="none"/>
+          <w:lang w:val="es-ES_tradnl" w:eastAsia="es-ES_tradnl"/>
+        </w:rPr>
+      </w:r>
+      <w:r>
+        <w:rPr>
+          <w:rFonts w:ascii="Aptos" w:eastAsia="Times New Roman" w:hAnsi="Aptos"/>
+          <w:b w:val="0"/>
+          <w:sz w:val="25"/>
+          <w:szCs w:val="25"/>
+          <w:u w:val="none"/>
+          <w:lang w:val="es-ES_tradnl" w:eastAsia="es-ES_tradnl"/>
+        </w:rPr>
+      </w:r>
+      <w:r>
+        <w:rPr>
+          <w:rFonts w:ascii="Aptos" w:eastAsia="Times New Roman" w:hAnsi="Aptos"/>
+          <w:b w:val="0"/>
+          <w:sz w:val="25"/>
+          <w:szCs w:val="25"/>
+          <w:u w:val="none"/>
+          <w:lang w:val="es-ES_tradnl" w:eastAsia="es-ES_tradnl"/>
+        </w:rPr>
+      </w:r>
+      <w:r>
+        <w:rPr>
+          <w:rFonts w:ascii="Aptos" w:eastAsia="Times New Roman" w:hAnsi="Aptos"/>
+          <w:b w:val="0"/>
+          <w:sz w:val="25"/>
+          <w:szCs w:val="25"/>
+          <w:u w:val="none"/>
           <w:lang w:val="es-ES_tradnl" w:eastAsia="es-ES_tradnl"/>
         </w:rPr>
       </w:r>
@@ -1996,8 +2185,10 @@
       <w:r>
         <w:rPr>
           <w:rFonts w:ascii="Aptos" w:eastAsia="Times New Roman" w:hAnsi="Aptos"/>
-          <w:sz w:val="25"/>
-          <w:szCs w:val="25"/>
+          <w:b w:val="0"/>
+          <w:sz w:val="25"/>
+          <w:szCs w:val="25"/>
+          <w:u w:val="none"/>
           <w:lang w:val="es-ES_tradnl" w:eastAsia="es-ES_tradnl"/>
         </w:rPr>
       </w:r>
@@ -2005,16 +2196,20 @@
       <w:r>
         <w:rPr>
           <w:rFonts w:ascii="Aptos" w:eastAsia="Times New Roman" w:hAnsi="Aptos"/>
-          <w:sz w:val="25"/>
-          <w:szCs w:val="25"/>
-          <w:lang w:val="es-ES_tradnl" w:eastAsia="es-ES_tradnl"/>
-        </w:rPr>
-      </w:r>
-      <w:r>
-        <w:rPr>
-          <w:rFonts w:ascii="Aptos" w:eastAsia="Times New Roman" w:hAnsi="Aptos"/>
-          <w:sz w:val="25"/>
-          <w:szCs w:val="25"/>
+          <w:b w:val="0"/>
+          <w:sz w:val="25"/>
+          <w:szCs w:val="25"/>
+          <w:u w:val="none"/>
+          <w:lang w:val="es-ES_tradnl" w:eastAsia="es-ES_tradnl"/>
+        </w:rPr>
+      </w:r>
+      <w:r>
+        <w:rPr>
+          <w:rFonts w:ascii="Aptos" w:eastAsia="Times New Roman" w:hAnsi="Aptos"/>
+          <w:b w:val="0"/>
+          <w:sz w:val="25"/>
+          <w:szCs w:val="25"/>
+          <w:u w:val="none"/>
           <w:lang w:val="es-ES_tradnl" w:eastAsia="es-ES_tradnl"/>
         </w:rPr>
       </w:r>

</xml_diff>